<commit_message>
fix: completa i criteri del progetto infanzia
</commit_message>
<xml_diff>
--- a/materiali/terzo/infanzia-progetto-operativo.docx
+++ b/materiali/terzo/infanzia-progetto-operativo.docx
@@ -1440,8 +1440,7 @@
                 <w:sz w:val="21"/>
                 <w:szCs w:val="21"/>
               </w:rPr>
-              <w:lastRenderedPageBreak/>
-              <w:t>Riferimento dispensa §7: le cinque domande da porsi prima di usare un materiale</w:t>
+              <w:t xml:space="preserve">Valutare i materiali: sei criteri, da applicare tutti</w:t>
             </w:r>
           </w:p>
           <w:p>
@@ -1453,7 +1452,7 @@
                 <w:sz w:val="21"/>
                 <w:szCs w:val="21"/>
               </w:rPr>
-              <w:t>La dispensa dice: 'La cesta dei tappi, i chiodini, la pasta di sale, le perline grandi non sono una coincidenza: è una scelta pedagogica.' Per ogni materiale che hai scelto, rispondi alle domande della dispensa.</w:t>
+              <w:t xml:space="preserve">Compila la tabella di sintesi. Scegli poi un materiale e valutalo con tutti e sei i criteri spiegati nella pagina del laboratorio. La sicurezza va controllata su ogni materiale previsto, anche dopo una sostituzione.</w:t>
             </w:r>
           </w:p>
         </w:tc>
@@ -1993,7 +1992,7 @@
                 <w:sz w:val="21"/>
                 <w:szCs w:val="21"/>
               </w:rPr>
-              <w:t>Tra i materiali che hai elencato, quale risponde meglio alle cinque domande della dispensa (§7)? Argomenta in 3-4 righe.</w:t>
+              <w:t xml:space="preserve">Per il materiale scelto valuta: sicurezza; adeguatezza al gruppo; possibilità di scelta; proprietà sensoriali pertinenti; azioni osservabili; riscontro e autonomia. Indica possibilità e limiti, senza sommare i criteri come un punteggio.</w:t>
             </w:r>
           </w:p>
         </w:tc>
@@ -7455,7 +7454,6 @@
       <w:pPr>
         <w:spacing w:after="100" w:line="250"/>
         <w:keepNext/>
-        <w:pageBreakBefore/>
       </w:pPr>
       <w:r>
         <w:rPr>

</xml_diff>